<commit_message>
feat: CI/CD pipeline + Docker + toutes les évolutions 2026-06
- Pipeline GitHub Actions staging (develop) + prod (main)
- Dockerfiles API (NestJS+Python) et Frontend (Angular+nginx)
- docker-compose infra (nginx SSL, certbot, portainer, pgadmin, n8n)
- docker-compose staging (port 8080) et prod (port 443)
- Scripts init-server.sh, deploy-staging.sh, deploy-prod.sh
- Suppression dist/ du suivi git + .gitignore racine
- Module Brief : LLM sections B/C/D (Claude/Mistral), timeline PNG
- Clôture budget + archive ZIP
- Seed complet (super_admin + cost items + config lists)
- Endpoint /api/health pour les health checks

Co-Authored-By: Claude Sonnet 4.6 <noreply@anthropic.com>
</commit_message>
<xml_diff>
--- a/lhspla-api/src/missions/templates/ODM_ready.docx
+++ b/lhspla-api/src/missions/templates/ODM_ready.docx
@@ -1782,6 +1782,44 @@
           <w:szCs w:val="20"/>
         </w:rPr>
         <w:t xml:space="preserve"> {dateReprise}</w:t>
+      </w:r>
+    </w:p>
+    <w:p>
+      <w:pPr>
+        <w:spacing w:after="0" w:line="240" w:lineRule="auto"/>
+        <w:jc w:val="both"/>
+        <w:rPr>
+          <w:rFonts w:ascii="Century Gothic" w:hAnsi="Century Gothic"/>
+          <w:sz w:val="20"/>
+          <w:szCs w:val="20"/>
+        </w:rPr>
+      </w:pPr>
+      <w:r>
+        <w:rPr>
+          <w:rFonts w:ascii="Century Gothic" w:hAnsi="Century Gothic"/>
+          <w:b/>
+          <w:bCs/>
+          <w:sz w:val="20"/>
+          <w:szCs w:val="20"/>
+        </w:rPr>
+        <w:t>MOYEN DE TRANSPORT</w:t>
+      </w:r>
+      <w:r>
+        <w:rPr>
+          <w:rFonts w:ascii="Century Gothic" w:hAnsi="Century Gothic"/>
+          <w:sz w:val="20"/>
+          <w:szCs w:val="20"/>
+        </w:rPr>
+        <w:tab/>
+        <w:t>:</w:t>
+      </w:r>
+      <w:r>
+        <w:rPr>
+          <w:rFonts w:ascii="Century Gothic" w:hAnsi="Century Gothic"/>
+          <w:sz w:val="20"/>
+          <w:szCs w:val="20"/>
+        </w:rPr>
+        <w:t xml:space="preserve"> {moyenTransport}</w:t>
       </w:r>
     </w:p>
     <w:p>

</xml_diff>